<commit_message>
Update Revit Execution Plan.docx from SharePoint
Copied from Digital Systems SharePoint: BIM Docs/7000_BIM Execution Plan/Revit Execution Plan.docx
</commit_message>
<xml_diff>
--- a/skills/revit/Revit Execution Plan.docx
+++ b/skills/revit/Revit Execution Plan.docx
@@ -1890,12 +1890,11 @@
             </w:r>
             <w:r>
               <w:rPr>
-                <w:rStyle w:val="Strong"/>
                 <w:rFonts w:ascii="Arial" w:hAnsi="Arial" w:cs="Arial"/>
                 <w:sz w:val="20"/>
                 <w:szCs w:val="20"/>
               </w:rPr>
-              <w:t xml:space="preserve"> + Corridor walls</w:t>
+              <w:t xml:space="preserve"> (walls between units)</w:t>
             </w:r>
             <w:r>
               <w:rPr>
@@ -1903,7 +1902,25 @@
                 <w:sz w:val="20"/>
                 <w:szCs w:val="20"/>
               </w:rPr>
-              <w:t xml:space="preserve"> (walls between units)</w:t>
+              <w:t xml:space="preserve"> (sometimes can also </w:t>
+            </w:r>
+            <w:proofErr w:type="spellStart"/>
+            <w:r>
+              <w:rPr>
+                <w:rFonts w:ascii="Arial" w:hAnsi="Arial" w:cs="Arial"/>
+                <w:sz w:val="20"/>
+                <w:szCs w:val="20"/>
+              </w:rPr>
+              <w:t>includes</w:t>
+            </w:r>
+            <w:proofErr w:type="spellEnd"/>
+            <w:r>
+              <w:rPr>
+                <w:rFonts w:ascii="Arial" w:hAnsi="Arial" w:cs="Arial"/>
+                <w:sz w:val="20"/>
+                <w:szCs w:val="20"/>
+              </w:rPr>
+              <w:t xml:space="preserve"> corridor walls)</w:t>
             </w:r>
           </w:p>
         </w:tc>
@@ -1959,6 +1976,11 @@
             <w:pPr>
               <w:pStyle w:val="NormalWeb"/>
               <w:jc w:val="both"/>
+              <w:rPr>
+                <w:rFonts w:ascii="Arial" w:hAnsi="Arial" w:cs="Arial"/>
+                <w:sz w:val="20"/>
+                <w:szCs w:val="20"/>
+              </w:rPr>
             </w:pPr>
             <w:r>
               <w:rPr>
@@ -1975,36 +1997,6 @@
                 <w:szCs w:val="20"/>
               </w:rPr>
               <w:t>y</w:t>
-            </w:r>
-            <w:r>
-              <w:rPr>
-                <w:rFonts w:ascii="Arial" w:hAnsi="Arial" w:cs="Arial"/>
-                <w:sz w:val="20"/>
-                <w:szCs w:val="20"/>
-              </w:rPr>
-              <w:t xml:space="preserve"> </w:t>
-            </w:r>
-            <w:r>
-              <w:t xml:space="preserve">and </w:t>
-            </w:r>
-          </w:p>
-          <w:p>
-            <w:pPr>
-              <w:pStyle w:val="NormalWeb"/>
-              <w:jc w:val="both"/>
-              <w:rPr>
-                <w:rFonts w:ascii="Arial" w:hAnsi="Arial" w:cs="Arial"/>
-                <w:sz w:val="20"/>
-                <w:szCs w:val="20"/>
-              </w:rPr>
-            </w:pPr>
-            <w:r>
-              <w:rPr>
-                <w:rFonts w:ascii="Arial" w:hAnsi="Arial" w:cs="Arial"/>
-                <w:sz w:val="20"/>
-                <w:szCs w:val="20"/>
-              </w:rPr>
-              <w:t>corridor walls and corridor-side door leaves</w:t>
             </w:r>
           </w:p>
         </w:tc>
@@ -2236,6 +2228,171 @@
                 <w:sz w:val="20"/>
                 <w:szCs w:val="20"/>
               </w:rPr>
+              <w:t>Corridor walls</w:t>
+            </w:r>
+          </w:p>
+        </w:tc>
+        <w:tc>
+          <w:tcPr>
+            <w:tcW w:w="4111" w:type="dxa"/>
+            <w:tcBorders>
+              <w:top w:val="single" w:sz="6" w:space="0" w:color="auto"/>
+              <w:left w:val="single" w:sz="6" w:space="0" w:color="auto"/>
+              <w:bottom w:val="single" w:sz="6" w:space="0" w:color="auto"/>
+              <w:right w:val="single" w:sz="6" w:space="0" w:color="auto"/>
+            </w:tcBorders>
+            <w:tcMar>
+              <w:top w:w="75" w:type="dxa"/>
+              <w:left w:w="75" w:type="dxa"/>
+              <w:bottom w:w="75" w:type="dxa"/>
+              <w:right w:w="75" w:type="dxa"/>
+            </w:tcMar>
+            <w:vAlign w:val="center"/>
+            <w:hideMark/>
+          </w:tcPr>
+          <w:p>
+            <w:pPr>
+              <w:pStyle w:val="NormalWeb"/>
+              <w:jc w:val="both"/>
+              <w:rPr>
+                <w:rFonts w:ascii="Arial" w:hAnsi="Arial" w:cs="Arial"/>
+                <w:sz w:val="20"/>
+                <w:szCs w:val="20"/>
+              </w:rPr>
+            </w:pPr>
+            <w:r>
+              <w:rPr>
+                <w:rFonts w:ascii="Arial" w:hAnsi="Arial" w:cs="Arial"/>
+                <w:sz w:val="20"/>
+                <w:szCs w:val="20"/>
+              </w:rPr>
+              <w:t>Usually unchanged between levels.</w:t>
+            </w:r>
+          </w:p>
+          <w:p>
+            <w:pPr>
+              <w:pStyle w:val="NormalWeb"/>
+              <w:jc w:val="both"/>
+              <w:rPr>
+                <w:rFonts w:ascii="Arial" w:hAnsi="Arial" w:cs="Arial"/>
+                <w:sz w:val="20"/>
+                <w:szCs w:val="20"/>
+              </w:rPr>
+            </w:pPr>
+            <w:r>
+              <w:rPr>
+                <w:rFonts w:ascii="Arial" w:hAnsi="Arial" w:cs="Arial"/>
+                <w:sz w:val="20"/>
+                <w:szCs w:val="20"/>
+              </w:rPr>
+              <w:t>If impertinency wall already includes corridor wall, skip it in the project</w:t>
+            </w:r>
+          </w:p>
+        </w:tc>
+        <w:tc>
+          <w:tcPr>
+            <w:tcW w:w="3019" w:type="dxa"/>
+            <w:tcBorders>
+              <w:top w:val="single" w:sz="6" w:space="0" w:color="auto"/>
+              <w:left w:val="single" w:sz="6" w:space="0" w:color="auto"/>
+              <w:bottom w:val="single" w:sz="6" w:space="0" w:color="auto"/>
+              <w:right w:val="single" w:sz="6" w:space="0" w:color="auto"/>
+            </w:tcBorders>
+          </w:tcPr>
+          <w:p>
+            <w:pPr>
+              <w:pStyle w:val="NormalWeb"/>
+              <w:jc w:val="both"/>
+              <w:rPr>
+                <w:rFonts w:ascii="Arial" w:hAnsi="Arial" w:cs="Arial"/>
+                <w:sz w:val="20"/>
+                <w:szCs w:val="20"/>
+              </w:rPr>
+            </w:pPr>
+            <w:r>
+              <w:rPr>
+                <w:rFonts w:ascii="Arial" w:hAnsi="Arial" w:cs="Arial"/>
+                <w:sz w:val="20"/>
+                <w:szCs w:val="20"/>
+              </w:rPr>
+              <w:t>corridor walls and corridor-side door leaves</w:t>
+            </w:r>
+          </w:p>
+        </w:tc>
+      </w:tr>
+      <w:tr>
+        <w:trPr>
+          <w:cantSplit/>
+        </w:trPr>
+        <w:tc>
+          <w:tcPr>
+            <w:tcW w:w="0" w:type="auto"/>
+            <w:tcBorders>
+              <w:top w:val="single" w:sz="6" w:space="0" w:color="auto"/>
+              <w:left w:val="single" w:sz="6" w:space="0" w:color="auto"/>
+              <w:bottom w:val="single" w:sz="6" w:space="0" w:color="auto"/>
+              <w:right w:val="single" w:sz="6" w:space="0" w:color="auto"/>
+            </w:tcBorders>
+            <w:tcMar>
+              <w:top w:w="75" w:type="dxa"/>
+              <w:left w:w="75" w:type="dxa"/>
+              <w:bottom w:w="75" w:type="dxa"/>
+              <w:right w:w="75" w:type="dxa"/>
+            </w:tcMar>
+            <w:vAlign w:val="center"/>
+            <w:hideMark/>
+          </w:tcPr>
+          <w:p>
+            <w:pPr>
+              <w:pStyle w:val="NormalWeb"/>
+              <w:jc w:val="both"/>
+              <w:rPr>
+                <w:rFonts w:ascii="Arial" w:hAnsi="Arial" w:cs="Arial"/>
+              </w:rPr>
+            </w:pPr>
+            <w:r>
+              <w:rPr>
+                <w:rFonts w:ascii="Arial" w:hAnsi="Arial" w:cs="Arial"/>
+              </w:rPr>
+              <w:t>5</w:t>
+            </w:r>
+          </w:p>
+        </w:tc>
+        <w:tc>
+          <w:tcPr>
+            <w:tcW w:w="1976" w:type="dxa"/>
+            <w:tcBorders>
+              <w:top w:val="single" w:sz="6" w:space="0" w:color="auto"/>
+              <w:left w:val="single" w:sz="6" w:space="0" w:color="auto"/>
+              <w:bottom w:val="single" w:sz="6" w:space="0" w:color="auto"/>
+              <w:right w:val="single" w:sz="6" w:space="0" w:color="auto"/>
+            </w:tcBorders>
+            <w:tcMar>
+              <w:top w:w="75" w:type="dxa"/>
+              <w:left w:w="75" w:type="dxa"/>
+              <w:bottom w:w="75" w:type="dxa"/>
+              <w:right w:w="75" w:type="dxa"/>
+            </w:tcMar>
+            <w:vAlign w:val="center"/>
+            <w:hideMark/>
+          </w:tcPr>
+          <w:p>
+            <w:pPr>
+              <w:pStyle w:val="NormalWeb"/>
+              <w:jc w:val="both"/>
+              <w:rPr>
+                <w:rFonts w:ascii="Arial" w:hAnsi="Arial" w:cs="Arial"/>
+                <w:sz w:val="20"/>
+                <w:szCs w:val="20"/>
+              </w:rPr>
+            </w:pPr>
+            <w:r>
+              <w:rPr>
+                <w:rStyle w:val="Strong"/>
+                <w:rFonts w:ascii="Arial" w:hAnsi="Arial" w:cs="Arial"/>
+                <w:sz w:val="20"/>
+                <w:szCs w:val="20"/>
+              </w:rPr>
               <w:t>Core walls</w:t>
             </w:r>
             <w:r>
@@ -2325,118 +2482,6 @@
           </w:p>
         </w:tc>
       </w:tr>
-      <w:tr>
-        <w:trPr>
-          <w:cantSplit/>
-        </w:trPr>
-        <w:tc>
-          <w:tcPr>
-            <w:tcW w:w="0" w:type="auto"/>
-            <w:tcBorders>
-              <w:top w:val="single" w:sz="6" w:space="0" w:color="auto"/>
-              <w:left w:val="single" w:sz="6" w:space="0" w:color="auto"/>
-              <w:bottom w:val="single" w:sz="6" w:space="0" w:color="auto"/>
-              <w:right w:val="single" w:sz="6" w:space="0" w:color="auto"/>
-            </w:tcBorders>
-            <w:tcMar>
-              <w:top w:w="75" w:type="dxa"/>
-              <w:left w:w="75" w:type="dxa"/>
-              <w:bottom w:w="75" w:type="dxa"/>
-              <w:right w:w="75" w:type="dxa"/>
-            </w:tcMar>
-            <w:vAlign w:val="center"/>
-          </w:tcPr>
-          <w:p>
-            <w:pPr>
-              <w:pStyle w:val="NormalWeb"/>
-              <w:jc w:val="both"/>
-              <w:rPr>
-                <w:rFonts w:ascii="Arial" w:hAnsi="Arial" w:cs="Arial"/>
-              </w:rPr>
-            </w:pPr>
-          </w:p>
-        </w:tc>
-        <w:tc>
-          <w:tcPr>
-            <w:tcW w:w="1976" w:type="dxa"/>
-            <w:tcBorders>
-              <w:top w:val="single" w:sz="6" w:space="0" w:color="auto"/>
-              <w:left w:val="single" w:sz="6" w:space="0" w:color="auto"/>
-              <w:bottom w:val="single" w:sz="6" w:space="0" w:color="auto"/>
-              <w:right w:val="single" w:sz="6" w:space="0" w:color="auto"/>
-            </w:tcBorders>
-            <w:tcMar>
-              <w:top w:w="75" w:type="dxa"/>
-              <w:left w:w="75" w:type="dxa"/>
-              <w:bottom w:w="75" w:type="dxa"/>
-              <w:right w:w="75" w:type="dxa"/>
-            </w:tcMar>
-            <w:vAlign w:val="center"/>
-          </w:tcPr>
-          <w:p>
-            <w:pPr>
-              <w:pStyle w:val="NormalWeb"/>
-              <w:jc w:val="both"/>
-              <w:rPr>
-                <w:rFonts w:ascii="Arial" w:hAnsi="Arial" w:cs="Arial"/>
-                <w:sz w:val="20"/>
-                <w:szCs w:val="20"/>
-              </w:rPr>
-            </w:pPr>
-          </w:p>
-        </w:tc>
-        <w:tc>
-          <w:tcPr>
-            <w:tcW w:w="4111" w:type="dxa"/>
-            <w:tcBorders>
-              <w:top w:val="single" w:sz="6" w:space="0" w:color="auto"/>
-              <w:left w:val="single" w:sz="6" w:space="0" w:color="auto"/>
-              <w:bottom w:val="single" w:sz="6" w:space="0" w:color="auto"/>
-              <w:right w:val="single" w:sz="6" w:space="0" w:color="auto"/>
-            </w:tcBorders>
-            <w:tcMar>
-              <w:top w:w="75" w:type="dxa"/>
-              <w:left w:w="75" w:type="dxa"/>
-              <w:bottom w:w="75" w:type="dxa"/>
-              <w:right w:w="75" w:type="dxa"/>
-            </w:tcMar>
-            <w:vAlign w:val="center"/>
-          </w:tcPr>
-          <w:p>
-            <w:pPr>
-              <w:pStyle w:val="NormalWeb"/>
-              <w:jc w:val="both"/>
-              <w:rPr>
-                <w:rFonts w:ascii="Arial" w:hAnsi="Arial" w:cs="Arial"/>
-                <w:sz w:val="20"/>
-                <w:szCs w:val="20"/>
-              </w:rPr>
-            </w:pPr>
-          </w:p>
-        </w:tc>
-        <w:tc>
-          <w:tcPr>
-            <w:tcW w:w="3019" w:type="dxa"/>
-            <w:tcBorders>
-              <w:top w:val="single" w:sz="6" w:space="0" w:color="auto"/>
-              <w:left w:val="single" w:sz="6" w:space="0" w:color="auto"/>
-              <w:bottom w:val="single" w:sz="6" w:space="0" w:color="auto"/>
-              <w:right w:val="single" w:sz="6" w:space="0" w:color="auto"/>
-            </w:tcBorders>
-          </w:tcPr>
-          <w:p>
-            <w:pPr>
-              <w:pStyle w:val="NormalWeb"/>
-              <w:jc w:val="both"/>
-              <w:rPr>
-                <w:rFonts w:ascii="Arial" w:hAnsi="Arial" w:cs="Arial"/>
-                <w:sz w:val="20"/>
-                <w:szCs w:val="20"/>
-              </w:rPr>
-            </w:pPr>
-          </w:p>
-        </w:tc>
-      </w:tr>
     </w:tbl>
     <w:p>
       <w:pPr>
@@ -2480,25 +2525,66 @@
           <w:bCs/>
           <w:szCs w:val="20"/>
         </w:rPr>
-        <w:t xml:space="preserve">Include the level </w:t>
-      </w:r>
-      <w:proofErr w:type="gramStart"/>
-      <w:r>
+        <w:t>Typical Group naming is as follows</w:t>
+      </w:r>
+    </w:p>
+    <w:p>
+      <w:pPr>
+        <w:spacing w:after="0"/>
+        <w:jc w:val="both"/>
         <w:rPr>
           <w:rFonts w:ascii="Arial" w:hAnsi="Arial" w:cs="Arial"/>
           <w:bCs/>
           <w:szCs w:val="20"/>
         </w:rPr>
-        <w:t>range</w:t>
-      </w:r>
-      <w:proofErr w:type="gramEnd"/>
+      </w:pPr>
       <w:r>
         <w:rPr>
           <w:rFonts w:ascii="Arial" w:hAnsi="Arial" w:cs="Arial"/>
           <w:bCs/>
           <w:szCs w:val="20"/>
         </w:rPr>
-        <w:t xml:space="preserve"> the group spans, for easier tracking and scheduling:</w:t>
+        <w:t>&lt;Building name&gt;-&lt;Group Name&gt;_&lt; Levell Start</w:t>
+      </w:r>
+      <w:r>
+        <w:rPr>
+          <w:rFonts w:ascii="Arial" w:hAnsi="Arial" w:cs="Arial"/>
+          <w:bCs/>
+          <w:szCs w:val="20"/>
+        </w:rPr>
+        <w:t>&gt;</w:t>
+      </w:r>
+      <w:r>
+        <w:rPr>
+          <w:rFonts w:ascii="Arial" w:hAnsi="Arial" w:cs="Arial"/>
+          <w:bCs/>
+          <w:szCs w:val="20"/>
+        </w:rPr>
+        <w:t>-</w:t>
+      </w:r>
+      <w:r>
+        <w:rPr>
+          <w:rFonts w:ascii="Arial" w:hAnsi="Arial" w:cs="Arial"/>
+          <w:bCs/>
+          <w:szCs w:val="20"/>
+        </w:rPr>
+        <w:t>&lt;</w:t>
+      </w:r>
+      <w:r>
+        <w:rPr>
+          <w:rFonts w:ascii="Arial" w:hAnsi="Arial" w:cs="Arial"/>
+          <w:bCs/>
+          <w:szCs w:val="20"/>
+        </w:rPr>
+        <w:t>Level</w:t>
+      </w:r>
+      <w:r>
+        <w:rPr>
+          <w:rFonts w:ascii="Arial" w:hAnsi="Arial" w:cs="Arial"/>
+          <w:bCs/>
+          <w:szCs w:val="20"/>
+        </w:rPr>
+        <w:t xml:space="preserve"> End&gt;</w:t>
       </w:r>
     </w:p>
     <w:p>
@@ -2517,7 +2603,25 @@
           <w:bCs/>
           <w:szCs w:val="20"/>
         </w:rPr>
-        <w:t xml:space="preserve">&lt;building name&gt;-&lt;Group Name&gt;_&lt;Start Level-End Level&gt; </w:t>
+        <w:t xml:space="preserve">Include the level </w:t>
+      </w:r>
+      <w:proofErr w:type="gramStart"/>
+      <w:r>
+        <w:rPr>
+          <w:rFonts w:ascii="Arial" w:hAnsi="Arial" w:cs="Arial"/>
+          <w:bCs/>
+          <w:szCs w:val="20"/>
+        </w:rPr>
+        <w:t>range</w:t>
+      </w:r>
+      <w:proofErr w:type="gramEnd"/>
+      <w:r>
+        <w:rPr>
+          <w:rFonts w:ascii="Arial" w:hAnsi="Arial" w:cs="Arial"/>
+          <w:bCs/>
+          <w:szCs w:val="20"/>
+        </w:rPr>
+        <w:t xml:space="preserve"> the group spans, for easier tracking and scheduling:</w:t>
       </w:r>
     </w:p>
     <w:p>
@@ -2659,6 +2763,7 @@
                 <w:sz w:val="20"/>
                 <w:szCs w:val="20"/>
               </w:rPr>
+              <w:lastRenderedPageBreak/>
               <w:t>2</w:t>
             </w:r>
           </w:p>
@@ -3334,16 +3439,14 @@
         </w:rPr>
         <w:t xml:space="preserve">Never press "Ungroup". If Revit </w:t>
       </w:r>
-      <w:proofErr w:type="gramStart"/>
       <w:r>
         <w:rPr>
           <w:rFonts w:ascii="Arial" w:hAnsi="Arial" w:cs="Arial"/>
           <w:bCs/>
           <w:szCs w:val="20"/>
         </w:rPr>
-        <w:t>prompts to</w:t>
-      </w:r>
-      <w:proofErr w:type="gramEnd"/>
+        <w:t>prompts</w:t>
+      </w:r>
       <w:r>
         <w:rPr>
           <w:rFonts w:ascii="Arial" w:hAnsi="Arial" w:cs="Arial"/>
@@ -3416,7 +3519,49 @@
           <w:bCs/>
           <w:szCs w:val="20"/>
         </w:rPr>
-        <w:t xml:space="preserve"> used 2 or more times. Do not group if you are using it once. It is unnecessary and will slow the model.</w:t>
+        <w:t xml:space="preserve"> used 2 or more times</w:t>
+      </w:r>
+      <w:r>
+        <w:rPr>
+          <w:rFonts w:ascii="Arial" w:hAnsi="Arial" w:cs="Arial"/>
+          <w:bCs/>
+          <w:szCs w:val="20"/>
+        </w:rPr>
+        <w:t xml:space="preserve"> (with an exception for </w:t>
+      </w:r>
+      <w:r>
+        <w:rPr>
+          <w:rFonts w:ascii="Arial" w:hAnsi="Arial" w:cs="Arial"/>
+          <w:bCs/>
+          <w:szCs w:val="20"/>
+        </w:rPr>
+        <w:t xml:space="preserve">the </w:t>
+      </w:r>
+      <w:proofErr w:type="gramStart"/>
+      <w:r>
+        <w:rPr>
+          <w:rFonts w:ascii="Arial" w:hAnsi="Arial" w:cs="Arial"/>
+          <w:bCs/>
+          <w:szCs w:val="20"/>
+        </w:rPr>
+        <w:t>5 group</w:t>
+      </w:r>
+      <w:proofErr w:type="gramEnd"/>
+      <w:r>
+        <w:rPr>
+          <w:rFonts w:ascii="Arial" w:hAnsi="Arial" w:cs="Arial"/>
+          <w:bCs/>
+          <w:szCs w:val="20"/>
+        </w:rPr>
+        <w:t xml:space="preserve"> category above)</w:t>
+      </w:r>
+      <w:r>
+        <w:rPr>
+          <w:rFonts w:ascii="Arial" w:hAnsi="Arial" w:cs="Arial"/>
+          <w:bCs/>
+          <w:szCs w:val="20"/>
+        </w:rPr>
+        <w:t>. Do not group if you are using it once. It is unnecessary and will slow the model.</w:t>
       </w:r>
     </w:p>
     <w:p>
@@ -5223,7 +5368,7 @@
               <w:sz w:val="18"/>
               <w:szCs w:val="18"/>
             </w:rPr>
-            <w:t>25/09/26</w:t>
+            <w:t>26/09/26</w:t>
           </w:r>
           <w:r>
             <w:rPr>

</xml_diff>

<commit_message>
add ability to model floor slabs
</commit_message>
<xml_diff>
--- a/skills/revit/Revit Execution Plan.docx
+++ b/skills/revit/Revit Execution Plan.docx
@@ -304,19 +304,8 @@
                 <w:bCs/>
                 <w:lang w:val="en-AU"/>
               </w:rPr>
-              <w:t xml:space="preserve">Model </w:t>
+              <w:t>Model Manager :</w:t>
             </w:r>
-            <w:proofErr w:type="gramStart"/>
-            <w:r>
-              <w:rPr>
-                <w:rFonts w:ascii="Arial" w:hAnsi="Arial" w:cs="Arial"/>
-                <w:b/>
-                <w:bCs/>
-                <w:lang w:val="en-AU"/>
-              </w:rPr>
-              <w:t>Manager :</w:t>
-            </w:r>
-            <w:proofErr w:type="gramEnd"/>
           </w:p>
         </w:tc>
         <w:tc>
@@ -634,23 +623,53 @@
     </w:p>
     <w:p>
       <w:pPr>
-        <w:pStyle w:val="Heading1"/>
-      </w:pPr>
-      <w:r>
-        <w:t>2</w:t>
-      </w:r>
-      <w:r>
-        <w:t>.</w:t>
-      </w:r>
-      <w:r>
-        <w:t>0</w:t>
-      </w:r>
-      <w:r>
-        <w:t xml:space="preserve"> Survey verification in AutoCAD</w:t>
+        <w:jc w:val="both"/>
+        <w:rPr>
+          <w:rFonts w:ascii="Arial" w:hAnsi="Arial" w:cs="Arial"/>
+          <w:szCs w:val="20"/>
+        </w:rPr>
+      </w:pPr>
+      <w:r>
+        <w:rPr>
+          <w:rFonts w:ascii="Arial" w:hAnsi="Arial" w:cs="Arial"/>
+          <w:szCs w:val="20"/>
+        </w:rPr>
+        <w:t xml:space="preserve">Each GSA </w:t>
+      </w:r>
+      <w:r>
+        <w:rPr>
+          <w:rFonts w:ascii="Arial" w:hAnsi="Arial" w:cs="Arial"/>
+          <w:szCs w:val="20"/>
+        </w:rPr>
+        <w:t>discipline (</w:t>
+      </w:r>
+      <w:r>
+        <w:rPr>
+          <w:rFonts w:ascii="Arial" w:hAnsi="Arial" w:cs="Arial"/>
+          <w:szCs w:val="20"/>
+        </w:rPr>
+        <w:t>AR - LA – ID) should make a copy of the default shared parameter file into “Other” folder if they want to customize it for the project</w:t>
       </w:r>
     </w:p>
     <w:p>
       <w:pPr>
+        <w:pStyle w:val="Heading1"/>
+      </w:pPr>
+      <w:r>
+        <w:t>2</w:t>
+      </w:r>
+      <w:r>
+        <w:t>.</w:t>
+      </w:r>
+      <w:r>
+        <w:t>0</w:t>
+      </w:r>
+      <w:r>
+        <w:t xml:space="preserve"> Survey verification in AutoCAD</w:t>
+      </w:r>
+    </w:p>
+    <w:p>
+      <w:pPr>
         <w:spacing w:after="0"/>
         <w:jc w:val="both"/>
         <w:rPr>
@@ -703,23 +722,7 @@
           <w:rFonts w:ascii="Arial" w:eastAsia="Arial" w:hAnsi="Arial" w:cs="Arial"/>
           <w:szCs w:val="20"/>
         </w:rPr>
-        <w:t xml:space="preserve">The DWG was then moved in </w:t>
-      </w:r>
-      <w:proofErr w:type="gramStart"/>
-      <w:r>
-        <w:rPr>
-          <w:rFonts w:ascii="Arial" w:eastAsia="Arial" w:hAnsi="Arial" w:cs="Arial"/>
-          <w:szCs w:val="20"/>
-        </w:rPr>
-        <w:t>Revit</w:t>
-      </w:r>
-      <w:proofErr w:type="gramEnd"/>
-      <w:r>
-        <w:rPr>
-          <w:rFonts w:ascii="Arial" w:eastAsia="Arial" w:hAnsi="Arial" w:cs="Arial"/>
-          <w:szCs w:val="20"/>
-        </w:rPr>
-        <w:t xml:space="preserve"> so the identified corner aligned with the project origin (0,0,0), which is used as the building reference point. Coordinates were then acquired.</w:t>
+        <w:t>The DWG was then moved in Revit so the identified corner aligned with the project origin (0,0,0), which is used as the building reference point. Coordinates were then acquired.</w:t>
       </w:r>
     </w:p>
     <w:p>
@@ -761,31 +764,7 @@
           <w:sz w:val="22"/>
           <w:highlight w:val="yellow"/>
         </w:rPr>
-        <w:t xml:space="preserve">The project has not been </w:t>
-      </w:r>
-      <w:proofErr w:type="gramStart"/>
-      <w:r>
-        <w:rPr>
-          <w:rFonts w:ascii="Arial" w:hAnsi="Arial" w:cs="Arial"/>
-          <w:b/>
-          <w:bCs/>
-          <w:color w:val="FF0000"/>
-          <w:sz w:val="22"/>
-          <w:highlight w:val="yellow"/>
-        </w:rPr>
-        <w:t>setup</w:t>
-      </w:r>
-      <w:proofErr w:type="gramEnd"/>
-      <w:r>
-        <w:rPr>
-          <w:rFonts w:ascii="Arial" w:hAnsi="Arial" w:cs="Arial"/>
-          <w:b/>
-          <w:bCs/>
-          <w:color w:val="FF0000"/>
-          <w:sz w:val="22"/>
-          <w:highlight w:val="yellow"/>
-        </w:rPr>
-        <w:t xml:space="preserve"> with real world coordinates and will require a geolocated survey to establish.</w:t>
+        <w:t>The project has not been setup with real world coordinates and will require a geolocated survey to establish.</w:t>
       </w:r>
     </w:p>
     <w:p>
@@ -2482,6 +2461,223 @@
           </w:p>
         </w:tc>
       </w:tr>
+      <w:tr>
+        <w:trPr>
+          <w:cantSplit/>
+        </w:trPr>
+        <w:tc>
+          <w:tcPr>
+            <w:tcW w:w="0" w:type="auto"/>
+            <w:tcBorders>
+              <w:top w:val="single" w:sz="6" w:space="0" w:color="auto"/>
+              <w:left w:val="single" w:sz="6" w:space="0" w:color="auto"/>
+              <w:bottom w:val="single" w:sz="6" w:space="0" w:color="auto"/>
+              <w:right w:val="single" w:sz="6" w:space="0" w:color="auto"/>
+            </w:tcBorders>
+            <w:tcMar>
+              <w:top w:w="75" w:type="dxa"/>
+              <w:left w:w="75" w:type="dxa"/>
+              <w:bottom w:w="75" w:type="dxa"/>
+              <w:right w:w="75" w:type="dxa"/>
+            </w:tcMar>
+            <w:vAlign w:val="center"/>
+          </w:tcPr>
+          <w:p>
+            <w:pPr>
+              <w:pStyle w:val="NormalWeb"/>
+              <w:jc w:val="both"/>
+              <w:rPr>
+                <w:rStyle w:val="Strong"/>
+                <w:sz w:val="20"/>
+                <w:szCs w:val="20"/>
+              </w:rPr>
+            </w:pPr>
+            <w:r>
+              <w:rPr>
+                <w:rFonts w:ascii="Arial" w:hAnsi="Arial" w:cs="Arial"/>
+                <w:b/>
+                <w:bCs/>
+              </w:rPr>
+              <w:t>6</w:t>
+            </w:r>
+          </w:p>
+        </w:tc>
+        <w:tc>
+          <w:tcPr>
+            <w:tcW w:w="1976" w:type="dxa"/>
+            <w:tcBorders>
+              <w:top w:val="single" w:sz="6" w:space="0" w:color="auto"/>
+              <w:left w:val="single" w:sz="6" w:space="0" w:color="auto"/>
+              <w:bottom w:val="single" w:sz="6" w:space="0" w:color="auto"/>
+              <w:right w:val="single" w:sz="6" w:space="0" w:color="auto"/>
+            </w:tcBorders>
+            <w:tcMar>
+              <w:top w:w="75" w:type="dxa"/>
+              <w:left w:w="75" w:type="dxa"/>
+              <w:bottom w:w="75" w:type="dxa"/>
+              <w:right w:w="75" w:type="dxa"/>
+            </w:tcMar>
+            <w:vAlign w:val="center"/>
+          </w:tcPr>
+          <w:p>
+            <w:pPr>
+              <w:pStyle w:val="NormalWeb"/>
+              <w:jc w:val="both"/>
+              <w:rPr>
+                <w:rStyle w:val="Strong"/>
+                <w:rFonts w:ascii="Arial" w:hAnsi="Arial" w:cs="Arial"/>
+                <w:b w:val="0"/>
+                <w:bCs w:val="0"/>
+                <w:sz w:val="20"/>
+                <w:szCs w:val="20"/>
+              </w:rPr>
+            </w:pPr>
+            <w:r>
+              <w:rPr>
+                <w:rStyle w:val="Strong"/>
+                <w:rFonts w:ascii="Arial" w:hAnsi="Arial" w:cs="Arial"/>
+                <w:sz w:val="20"/>
+                <w:szCs w:val="20"/>
+              </w:rPr>
+              <w:t xml:space="preserve">Floor </w:t>
+            </w:r>
+            <w:r>
+              <w:rPr>
+                <w:rStyle w:val="Strong"/>
+                <w:rFonts w:ascii="Arial" w:hAnsi="Arial" w:cs="Arial"/>
+                <w:sz w:val="20"/>
+                <w:szCs w:val="20"/>
+              </w:rPr>
+              <w:t>Slab</w:t>
+            </w:r>
+            <w:r>
+              <w:rPr>
+                <w:rStyle w:val="Strong"/>
+                <w:rFonts w:ascii="Arial" w:hAnsi="Arial" w:cs="Arial"/>
+                <w:sz w:val="20"/>
+                <w:szCs w:val="20"/>
+              </w:rPr>
+              <w:t xml:space="preserve"> </w:t>
+            </w:r>
+          </w:p>
+        </w:tc>
+        <w:tc>
+          <w:tcPr>
+            <w:tcW w:w="4111" w:type="dxa"/>
+            <w:tcBorders>
+              <w:top w:val="single" w:sz="6" w:space="0" w:color="auto"/>
+              <w:left w:val="single" w:sz="6" w:space="0" w:color="auto"/>
+              <w:bottom w:val="single" w:sz="6" w:space="0" w:color="auto"/>
+              <w:right w:val="single" w:sz="6" w:space="0" w:color="auto"/>
+            </w:tcBorders>
+            <w:tcMar>
+              <w:top w:w="75" w:type="dxa"/>
+              <w:left w:w="75" w:type="dxa"/>
+              <w:bottom w:w="75" w:type="dxa"/>
+              <w:right w:w="75" w:type="dxa"/>
+            </w:tcMar>
+            <w:vAlign w:val="center"/>
+          </w:tcPr>
+          <w:p>
+            <w:pPr>
+              <w:pStyle w:val="NormalWeb"/>
+              <w:jc w:val="both"/>
+              <w:rPr>
+                <w:rFonts w:ascii="Arial" w:hAnsi="Arial" w:cs="Arial"/>
+                <w:sz w:val="20"/>
+                <w:szCs w:val="20"/>
+              </w:rPr>
+            </w:pPr>
+            <w:r>
+              <w:rPr>
+                <w:rStyle w:val="Strong"/>
+                <w:rFonts w:ascii="Arial" w:hAnsi="Arial" w:cs="Arial"/>
+                <w:sz w:val="20"/>
+                <w:szCs w:val="20"/>
+              </w:rPr>
+              <w:t>A typical concrete floor plate of each floor</w:t>
+            </w:r>
+            <w:r>
+              <w:rPr>
+                <w:rStyle w:val="Strong"/>
+                <w:rFonts w:ascii="Arial" w:hAnsi="Arial" w:cs="Arial"/>
+                <w:sz w:val="20"/>
+                <w:szCs w:val="20"/>
+              </w:rPr>
+              <w:t xml:space="preserve"> </w:t>
+            </w:r>
+          </w:p>
+        </w:tc>
+        <w:tc>
+          <w:tcPr>
+            <w:tcW w:w="3019" w:type="dxa"/>
+            <w:tcBorders>
+              <w:top w:val="single" w:sz="6" w:space="0" w:color="auto"/>
+              <w:left w:val="single" w:sz="6" w:space="0" w:color="auto"/>
+              <w:bottom w:val="single" w:sz="6" w:space="0" w:color="auto"/>
+              <w:right w:val="single" w:sz="6" w:space="0" w:color="auto"/>
+            </w:tcBorders>
+          </w:tcPr>
+          <w:p>
+            <w:pPr>
+              <w:pStyle w:val="NormalWeb"/>
+              <w:jc w:val="both"/>
+              <w:rPr>
+                <w:rFonts w:ascii="Arial" w:hAnsi="Arial" w:cs="Arial"/>
+                <w:sz w:val="20"/>
+                <w:szCs w:val="20"/>
+              </w:rPr>
+            </w:pPr>
+            <w:r>
+              <w:rPr>
+                <w:rStyle w:val="Strong"/>
+                <w:rFonts w:ascii="Arial" w:hAnsi="Arial" w:cs="Arial"/>
+                <w:sz w:val="20"/>
+                <w:szCs w:val="20"/>
+              </w:rPr>
+              <w:t>3D set down + cutouts + downpipe penetration holes or any cutouts/</w:t>
+            </w:r>
+            <w:r>
+              <w:rPr>
+                <w:rStyle w:val="Strong"/>
+                <w:rFonts w:ascii="Arial" w:hAnsi="Arial" w:cs="Arial"/>
+                <w:sz w:val="20"/>
+                <w:szCs w:val="20"/>
+              </w:rPr>
+              <w:t>set down</w:t>
+            </w:r>
+            <w:r>
+              <w:rPr>
+                <w:rStyle w:val="Strong"/>
+                <w:rFonts w:ascii="Arial" w:hAnsi="Arial" w:cs="Arial"/>
+                <w:sz w:val="20"/>
+                <w:szCs w:val="20"/>
+              </w:rPr>
+              <w:t xml:space="preserve"> that cuts a void into the floor)</w:t>
+            </w:r>
+            <w:r>
+              <w:rPr>
+                <w:rStyle w:val="Strong"/>
+                <w:rFonts w:ascii="Arial" w:hAnsi="Arial" w:cs="Arial"/>
+                <w:sz w:val="20"/>
+                <w:szCs w:val="20"/>
+              </w:rPr>
+              <w:br/>
+            </w:r>
+            <w:r>
+              <w:rPr>
+                <w:rFonts w:ascii="Arial" w:hAnsi="Arial" w:cs="Arial"/>
+                <w:sz w:val="20"/>
+                <w:szCs w:val="20"/>
+              </w:rPr>
+              <w:t>F</w:t>
+            </w:r>
+            <w:r>
+              <w:t>inish floors should not be included</w:t>
+            </w:r>
+          </w:p>
+        </w:tc>
+      </w:tr>
     </w:tbl>
     <w:p>
       <w:pPr>
@@ -2497,6 +2693,7 @@
         <w:pStyle w:val="Heading2"/>
       </w:pPr>
       <w:r>
+        <w:lastRenderedPageBreak/>
         <w:t>4</w:t>
       </w:r>
       <w:r>
@@ -2603,25 +2800,7 @@
           <w:bCs/>
           <w:szCs w:val="20"/>
         </w:rPr>
-        <w:t xml:space="preserve">Include the level </w:t>
-      </w:r>
-      <w:proofErr w:type="gramStart"/>
-      <w:r>
-        <w:rPr>
-          <w:rFonts w:ascii="Arial" w:hAnsi="Arial" w:cs="Arial"/>
-          <w:bCs/>
-          <w:szCs w:val="20"/>
-        </w:rPr>
-        <w:t>range</w:t>
-      </w:r>
-      <w:proofErr w:type="gramEnd"/>
-      <w:r>
-        <w:rPr>
-          <w:rFonts w:ascii="Arial" w:hAnsi="Arial" w:cs="Arial"/>
-          <w:bCs/>
-          <w:szCs w:val="20"/>
-        </w:rPr>
-        <w:t xml:space="preserve"> the group spans, for easier tracking and scheduling:</w:t>
+        <w:t>Include the level range the group spans, for easier tracking and scheduling:</w:t>
       </w:r>
     </w:p>
     <w:p>
@@ -2763,7 +2942,6 @@
                 <w:sz w:val="20"/>
                 <w:szCs w:val="20"/>
               </w:rPr>
-              <w:lastRenderedPageBreak/>
               <w:t>2</w:t>
             </w:r>
           </w:p>
@@ -3063,6 +3241,153 @@
           </w:p>
         </w:tc>
       </w:tr>
+      <w:tr>
+        <w:tc>
+          <w:tcPr>
+            <w:tcW w:w="421" w:type="dxa"/>
+            <w:shd w:val="clear" w:color="auto" w:fill="F2F2F2" w:themeFill="background1" w:themeFillShade="F2"/>
+          </w:tcPr>
+          <w:p>
+            <w:pPr>
+              <w:pStyle w:val="NormalWeb"/>
+              <w:tabs>
+                <w:tab w:val="left" w:pos="916"/>
+                <w:tab w:val="left" w:pos="1832"/>
+                <w:tab w:val="left" w:pos="2748"/>
+                <w:tab w:val="left" w:pos="3664"/>
+                <w:tab w:val="left" w:pos="4580"/>
+                <w:tab w:val="left" w:pos="5496"/>
+                <w:tab w:val="left" w:pos="6412"/>
+                <w:tab w:val="left" w:pos="7328"/>
+                <w:tab w:val="left" w:pos="8244"/>
+                <w:tab w:val="left" w:pos="9160"/>
+                <w:tab w:val="left" w:pos="10076"/>
+                <w:tab w:val="left" w:pos="10992"/>
+                <w:tab w:val="left" w:pos="11908"/>
+                <w:tab w:val="left" w:pos="12824"/>
+                <w:tab w:val="left" w:pos="13740"/>
+                <w:tab w:val="left" w:pos="14656"/>
+              </w:tabs>
+              <w:jc w:val="both"/>
+              <w:rPr>
+                <w:rFonts w:ascii="Arial" w:hAnsi="Arial" w:cs="Arial"/>
+                <w:sz w:val="20"/>
+                <w:szCs w:val="20"/>
+              </w:rPr>
+            </w:pPr>
+            <w:r>
+              <w:rPr>
+                <w:rFonts w:ascii="Arial" w:hAnsi="Arial" w:cs="Arial"/>
+                <w:sz w:val="20"/>
+                <w:szCs w:val="20"/>
+              </w:rPr>
+              <w:t>5</w:t>
+            </w:r>
+          </w:p>
+        </w:tc>
+        <w:tc>
+          <w:tcPr>
+            <w:tcW w:w="2273" w:type="dxa"/>
+            <w:shd w:val="clear" w:color="auto" w:fill="F2F2F2" w:themeFill="background1" w:themeFillShade="F2"/>
+          </w:tcPr>
+          <w:p>
+            <w:pPr>
+              <w:pStyle w:val="NormalWeb"/>
+              <w:tabs>
+                <w:tab w:val="left" w:pos="916"/>
+                <w:tab w:val="left" w:pos="1832"/>
+                <w:tab w:val="left" w:pos="2748"/>
+                <w:tab w:val="left" w:pos="3664"/>
+                <w:tab w:val="left" w:pos="4580"/>
+                <w:tab w:val="left" w:pos="5496"/>
+                <w:tab w:val="left" w:pos="6412"/>
+                <w:tab w:val="left" w:pos="7328"/>
+                <w:tab w:val="left" w:pos="8244"/>
+                <w:tab w:val="left" w:pos="9160"/>
+                <w:tab w:val="left" w:pos="10076"/>
+                <w:tab w:val="left" w:pos="10992"/>
+                <w:tab w:val="left" w:pos="11908"/>
+                <w:tab w:val="left" w:pos="12824"/>
+                <w:tab w:val="left" w:pos="13740"/>
+                <w:tab w:val="left" w:pos="14656"/>
+              </w:tabs>
+              <w:jc w:val="both"/>
+              <w:rPr>
+                <w:rFonts w:ascii="Arial" w:hAnsi="Arial" w:cs="Arial"/>
+                <w:sz w:val="20"/>
+                <w:szCs w:val="20"/>
+              </w:rPr>
+            </w:pPr>
+            <w:r>
+              <w:rPr>
+                <w:rFonts w:ascii="Arial" w:hAnsi="Arial" w:cs="Arial"/>
+                <w:sz w:val="20"/>
+                <w:szCs w:val="20"/>
+              </w:rPr>
+              <w:t>G-</w:t>
+            </w:r>
+            <w:r>
+              <w:rPr>
+                <w:rFonts w:ascii="Arial" w:hAnsi="Arial" w:cs="Arial"/>
+                <w:sz w:val="20"/>
+                <w:szCs w:val="20"/>
+              </w:rPr>
+              <w:t>Floor Slab</w:t>
+            </w:r>
+            <w:r>
+              <w:rPr>
+                <w:rFonts w:ascii="Arial" w:hAnsi="Arial" w:cs="Arial"/>
+                <w:sz w:val="20"/>
+                <w:szCs w:val="20"/>
+              </w:rPr>
+              <w:t>-L10</w:t>
+            </w:r>
+            <w:r>
+              <w:rPr>
+                <w:rFonts w:ascii="Arial" w:hAnsi="Arial" w:cs="Arial"/>
+                <w:sz w:val="20"/>
+                <w:szCs w:val="20"/>
+              </w:rPr>
+              <w:t>-L15</w:t>
+            </w:r>
+          </w:p>
+        </w:tc>
+        <w:tc>
+          <w:tcPr>
+            <w:tcW w:w="6656" w:type="dxa"/>
+            <w:shd w:val="clear" w:color="auto" w:fill="F2F2F2" w:themeFill="background1" w:themeFillShade="F2"/>
+          </w:tcPr>
+          <w:p>
+            <w:pPr>
+              <w:pStyle w:val="NormalWeb"/>
+              <w:tabs>
+                <w:tab w:val="left" w:pos="916"/>
+                <w:tab w:val="left" w:pos="1832"/>
+                <w:tab w:val="left" w:pos="2748"/>
+                <w:tab w:val="left" w:pos="3664"/>
+                <w:tab w:val="left" w:pos="4580"/>
+                <w:tab w:val="left" w:pos="5496"/>
+                <w:tab w:val="left" w:pos="6412"/>
+                <w:tab w:val="left" w:pos="7328"/>
+                <w:tab w:val="left" w:pos="8244"/>
+                <w:tab w:val="left" w:pos="9160"/>
+                <w:tab w:val="left" w:pos="10076"/>
+                <w:tab w:val="left" w:pos="10992"/>
+                <w:tab w:val="left" w:pos="11908"/>
+                <w:tab w:val="left" w:pos="12824"/>
+                <w:tab w:val="left" w:pos="13740"/>
+                <w:tab w:val="left" w:pos="14656"/>
+              </w:tabs>
+              <w:jc w:val="both"/>
+              <w:rPr>
+                <w:rFonts w:ascii="Arial" w:hAnsi="Arial" w:cs="Arial"/>
+                <w:sz w:val="20"/>
+                <w:szCs w:val="20"/>
+              </w:rPr>
+            </w:pPr>
+          </w:p>
+        </w:tc>
+      </w:tr>
     </w:tbl>
     <w:p>
       <w:pPr>
@@ -3338,23 +3663,13 @@
         </w:rPr>
         <w:t xml:space="preserve"> </w:t>
       </w:r>
-      <w:proofErr w:type="gramStart"/>
       <w:r>
         <w:rPr>
           <w:rFonts w:ascii="Arial" w:hAnsi="Arial" w:cs="Arial"/>
           <w:bCs/>
           <w:szCs w:val="20"/>
         </w:rPr>
-        <w:t>most-referenced</w:t>
-      </w:r>
-      <w:proofErr w:type="gramEnd"/>
-      <w:r>
-        <w:rPr>
-          <w:rFonts w:ascii="Arial" w:hAnsi="Arial" w:cs="Arial"/>
-          <w:bCs/>
-          <w:szCs w:val="20"/>
-        </w:rPr>
-        <w:t xml:space="preserve"> by other disciplines.</w:t>
+        <w:t>most-referenced by other disciplines.</w:t>
       </w:r>
     </w:p>
     <w:p>
@@ -3501,59 +3816,23 @@
           <w:bCs/>
           <w:szCs w:val="20"/>
         </w:rPr>
-        <w:t xml:space="preserve">Use group only if it </w:t>
-      </w:r>
-      <w:proofErr w:type="gramStart"/>
+        <w:t>Use group only if it will be used 2 or more times</w:t>
+      </w:r>
       <w:r>
         <w:rPr>
           <w:rFonts w:ascii="Arial" w:hAnsi="Arial" w:cs="Arial"/>
           <w:bCs/>
           <w:szCs w:val="20"/>
         </w:rPr>
-        <w:t>will be</w:t>
-      </w:r>
-      <w:proofErr w:type="gramEnd"/>
+        <w:t xml:space="preserve"> (with an exception for </w:t>
+      </w:r>
       <w:r>
         <w:rPr>
           <w:rFonts w:ascii="Arial" w:hAnsi="Arial" w:cs="Arial"/>
           <w:bCs/>
           <w:szCs w:val="20"/>
         </w:rPr>
-        <w:t xml:space="preserve"> used 2 or more times</w:t>
-      </w:r>
-      <w:r>
-        <w:rPr>
-          <w:rFonts w:ascii="Arial" w:hAnsi="Arial" w:cs="Arial"/>
-          <w:bCs/>
-          <w:szCs w:val="20"/>
-        </w:rPr>
-        <w:t xml:space="preserve"> (with an exception for </w:t>
-      </w:r>
-      <w:r>
-        <w:rPr>
-          <w:rFonts w:ascii="Arial" w:hAnsi="Arial" w:cs="Arial"/>
-          <w:bCs/>
-          <w:szCs w:val="20"/>
-        </w:rPr>
-        <w:t xml:space="preserve">the </w:t>
-      </w:r>
-      <w:proofErr w:type="gramStart"/>
-      <w:r>
-        <w:rPr>
-          <w:rFonts w:ascii="Arial" w:hAnsi="Arial" w:cs="Arial"/>
-          <w:bCs/>
-          <w:szCs w:val="20"/>
-        </w:rPr>
-        <w:t>5 group</w:t>
-      </w:r>
-      <w:proofErr w:type="gramEnd"/>
-      <w:r>
-        <w:rPr>
-          <w:rFonts w:ascii="Arial" w:hAnsi="Arial" w:cs="Arial"/>
-          <w:bCs/>
-          <w:szCs w:val="20"/>
-        </w:rPr>
-        <w:t xml:space="preserve"> category above)</w:t>
+        <w:t>the 5 group category above)</w:t>
       </w:r>
       <w:r>
         <w:rPr>
@@ -3609,25 +3888,7 @@
           <w:bCs/>
           <w:szCs w:val="20"/>
         </w:rPr>
-        <w:t xml:space="preserve">Avoid attaching detail groups to model </w:t>
-      </w:r>
-      <w:proofErr w:type="gramStart"/>
-      <w:r>
-        <w:rPr>
-          <w:rFonts w:ascii="Arial" w:hAnsi="Arial" w:cs="Arial"/>
-          <w:bCs/>
-          <w:szCs w:val="20"/>
-        </w:rPr>
-        <w:t>group</w:t>
-      </w:r>
-      <w:proofErr w:type="gramEnd"/>
-      <w:r>
-        <w:rPr>
-          <w:rFonts w:ascii="Arial" w:hAnsi="Arial" w:cs="Arial"/>
-          <w:bCs/>
-          <w:szCs w:val="20"/>
-        </w:rPr>
-        <w:t xml:space="preserve"> if possible</w:t>
+        <w:t>Avoid attaching detail groups to model group if possible</w:t>
       </w:r>
     </w:p>
     <w:p>
@@ -3675,40 +3936,22 @@
           <w:bCs/>
           <w:szCs w:val="20"/>
         </w:rPr>
-        <w:t xml:space="preserve">Modelling elements </w:t>
-      </w:r>
-      <w:proofErr w:type="gramStart"/>
-      <w:r>
+        <w:t>Modelling elements is preferred over the use of filled regions. Filled regions can help to make a drawing presentable. It can also be covering up unresolved design.</w:t>
+      </w:r>
+    </w:p>
+    <w:p>
+      <w:pPr>
+        <w:spacing w:after="0"/>
+        <w:jc w:val="both"/>
         <w:rPr>
           <w:rFonts w:ascii="Arial" w:hAnsi="Arial" w:cs="Arial"/>
           <w:bCs/>
           <w:szCs w:val="20"/>
         </w:rPr>
-        <w:t>is</w:t>
-      </w:r>
-      <w:proofErr w:type="gramEnd"/>
-      <w:r>
-        <w:rPr>
-          <w:rFonts w:ascii="Arial" w:hAnsi="Arial" w:cs="Arial"/>
-          <w:bCs/>
-          <w:szCs w:val="20"/>
-        </w:rPr>
-        <w:t xml:space="preserve"> preferred over the use of filled regions. Filled regions can help to make a drawing presentable. It can also be covering up unresolved design.</w:t>
-      </w:r>
+      </w:pPr>
     </w:p>
     <w:p>
       <w:pPr>
-        <w:spacing w:after="0"/>
-        <w:jc w:val="both"/>
-        <w:rPr>
-          <w:rFonts w:ascii="Arial" w:hAnsi="Arial" w:cs="Arial"/>
-          <w:bCs/>
-          <w:szCs w:val="20"/>
-        </w:rPr>
-      </w:pPr>
-    </w:p>
-    <w:p>
-      <w:pPr>
         <w:pStyle w:val="Heading2"/>
         <w:rPr>
           <w:color w:val="FF0000"/>
@@ -3718,6 +3961,7 @@
         <w:rPr>
           <w:color w:val="FF0000"/>
         </w:rPr>
+        <w:lastRenderedPageBreak/>
         <w:t>4</w:t>
       </w:r>
       <w:r>
@@ -3884,16 +4128,15 @@
           <w:bCs/>
           <w:szCs w:val="20"/>
         </w:rPr>
-        <w:t xml:space="preserve">Weekly Auto Publish setup </w:t>
-      </w:r>
-      <w:proofErr w:type="gramStart"/>
+        <w:t xml:space="preserve">Weekly Auto Publish setup – </w:t>
+      </w:r>
       <w:r>
         <w:rPr>
           <w:rFonts w:ascii="Arial" w:hAnsi="Arial" w:cs="Arial"/>
           <w:bCs/>
           <w:szCs w:val="20"/>
         </w:rPr>
-        <w:t xml:space="preserve">– </w:t>
+        <w:t xml:space="preserve"> </w:t>
       </w:r>
       <w:r>
         <w:rPr>
@@ -3901,7 +4144,7 @@
           <w:bCs/>
           <w:szCs w:val="20"/>
         </w:rPr>
-        <w:t xml:space="preserve"> </w:t>
+        <w:t>Date:</w:t>
       </w:r>
       <w:r>
         <w:rPr>
@@ -3909,16 +4152,15 @@
           <w:bCs/>
           <w:szCs w:val="20"/>
         </w:rPr>
-        <w:t>Date</w:t>
-      </w:r>
-      <w:proofErr w:type="gramEnd"/>
+        <w:tab/>
+      </w:r>
       <w:r>
         <w:rPr>
           <w:rFonts w:ascii="Arial" w:hAnsi="Arial" w:cs="Arial"/>
           <w:bCs/>
           <w:szCs w:val="20"/>
         </w:rPr>
-        <w:t>:</w:t>
+        <w:tab/>
       </w:r>
       <w:r>
         <w:rPr>
@@ -3927,6 +4169,7 @@
           <w:szCs w:val="20"/>
         </w:rPr>
         <w:tab/>
+        <w:t xml:space="preserve">Time: </w:t>
       </w:r>
       <w:r>
         <w:rPr>
@@ -3934,24 +4177,34 @@
           <w:bCs/>
           <w:szCs w:val="20"/>
         </w:rPr>
-        <w:tab/>
-      </w:r>
-      <w:r>
+        <w:t xml:space="preserve"> </w:t>
+      </w:r>
+    </w:p>
+    <w:p>
+      <w:pPr>
+        <w:spacing w:after="0"/>
+        <w:jc w:val="both"/>
         <w:rPr>
           <w:rFonts w:ascii="Arial" w:hAnsi="Arial" w:cs="Arial"/>
           <w:bCs/>
           <w:szCs w:val="20"/>
         </w:rPr>
-        <w:tab/>
-        <w:t xml:space="preserve">Time: </w:t>
-      </w:r>
+      </w:pPr>
       <w:r>
         <w:rPr>
           <w:rFonts w:ascii="Arial" w:hAnsi="Arial" w:cs="Arial"/>
           <w:bCs/>
           <w:szCs w:val="20"/>
         </w:rPr>
-        <w:t xml:space="preserve"> </w:t>
+        <w:t>Project team will need to create package and share</w:t>
+      </w:r>
+      <w:r>
+        <w:rPr>
+          <w:rFonts w:ascii="Arial" w:hAnsi="Arial" w:cs="Arial"/>
+          <w:bCs/>
+          <w:szCs w:val="20"/>
+        </w:rPr>
+        <w:t>.</w:t>
       </w:r>
     </w:p>
     <w:p>
@@ -3970,15 +4223,7 @@
           <w:bCs/>
           <w:szCs w:val="20"/>
         </w:rPr>
-        <w:t>Project team will need to create package and share</w:t>
-      </w:r>
-      <w:r>
-        <w:rPr>
-          <w:rFonts w:ascii="Arial" w:hAnsi="Arial" w:cs="Arial"/>
-          <w:bCs/>
-          <w:szCs w:val="20"/>
-        </w:rPr>
-        <w:t>.</w:t>
+        <w:t>Project team will need to consume packages from other consultant via ACC.</w:t>
       </w:r>
     </w:p>
     <w:p>
@@ -3988,49 +4233,12 @@
         <w:rPr>
           <w:rFonts w:ascii="Arial" w:hAnsi="Arial" w:cs="Arial"/>
           <w:bCs/>
-          <w:szCs w:val="20"/>
-        </w:rPr>
-      </w:pPr>
-      <w:r>
-        <w:rPr>
-          <w:rFonts w:ascii="Arial" w:hAnsi="Arial" w:cs="Arial"/>
-          <w:bCs/>
-          <w:szCs w:val="20"/>
-        </w:rPr>
-        <w:t xml:space="preserve">Project team will need to consume packages from </w:t>
-      </w:r>
-      <w:proofErr w:type="gramStart"/>
-      <w:r>
-        <w:rPr>
-          <w:rFonts w:ascii="Arial" w:hAnsi="Arial" w:cs="Arial"/>
-          <w:bCs/>
-          <w:szCs w:val="20"/>
-        </w:rPr>
-        <w:t>other</w:t>
-      </w:r>
-      <w:proofErr w:type="gramEnd"/>
-      <w:r>
-        <w:rPr>
-          <w:rFonts w:ascii="Arial" w:hAnsi="Arial" w:cs="Arial"/>
-          <w:bCs/>
-          <w:szCs w:val="20"/>
-        </w:rPr>
-        <w:t xml:space="preserve"> consultant via ACC.</w:t>
-      </w:r>
+          <w:sz w:val="22"/>
+        </w:rPr>
+      </w:pPr>
     </w:p>
     <w:p>
       <w:pPr>
-        <w:spacing w:after="0"/>
-        <w:jc w:val="both"/>
-        <w:rPr>
-          <w:rFonts w:ascii="Arial" w:hAnsi="Arial" w:cs="Arial"/>
-          <w:bCs/>
-          <w:sz w:val="22"/>
-        </w:rPr>
-      </w:pPr>
-    </w:p>
-    <w:p>
-      <w:pPr>
         <w:pStyle w:val="Heading2"/>
       </w:pPr>
       <w:r>
@@ -4040,15 +4248,7 @@
         <w:t>.2 Coordination</w:t>
       </w:r>
       <w:r>
-        <w:t xml:space="preserve"> </w:t>
-      </w:r>
-      <w:proofErr w:type="gramStart"/>
-      <w:r>
-        <w:t>( review</w:t>
-      </w:r>
-      <w:proofErr w:type="gramEnd"/>
-      <w:r>
-        <w:t xml:space="preserve"> before issuing)</w:t>
+        <w:t xml:space="preserve"> ( review before issuing)</w:t>
       </w:r>
     </w:p>
     <w:tbl>
@@ -4793,13 +4993,8 @@
         <w:t xml:space="preserve"> communicate this naming convention</w:t>
       </w:r>
       <w:r>
-        <w:t xml:space="preserve"> and standards for </w:t>
-      </w:r>
-      <w:proofErr w:type="gramStart"/>
-      <w:r>
-        <w:t>consultant</w:t>
-      </w:r>
-      <w:proofErr w:type="gramEnd"/>
+        <w:t xml:space="preserve"> and standards for consultant</w:t>
+      </w:r>
       <w:r>
         <w:t xml:space="preserve"> and how the view is set up when it comes to </w:t>
       </w:r>
@@ -4858,21 +5053,7 @@
         <w:rPr>
           <w:rFonts w:ascii="Arial" w:hAnsi="Arial" w:cs="Arial"/>
         </w:rPr>
-        <w:t xml:space="preserve">Purge the file 3x or until there </w:t>
-      </w:r>
-      <w:proofErr w:type="gramStart"/>
-      <w:r>
-        <w:rPr>
-          <w:rFonts w:ascii="Arial" w:hAnsi="Arial" w:cs="Arial"/>
-        </w:rPr>
-        <w:t>is</w:t>
-      </w:r>
-      <w:proofErr w:type="gramEnd"/>
-      <w:r>
-        <w:rPr>
-          <w:rFonts w:ascii="Arial" w:hAnsi="Arial" w:cs="Arial"/>
-        </w:rPr>
-        <w:t xml:space="preserve"> no elements to purge. (see note below)</w:t>
+        <w:t>Purge the file 3x or until there is no elements to purge. (see note below)</w:t>
       </w:r>
     </w:p>
     <w:p>
@@ -5074,21 +5255,7 @@
         <w:rPr>
           <w:rFonts w:ascii="Arial" w:hAnsi="Arial" w:cs="Arial"/>
         </w:rPr>
-        <w:t xml:space="preserve"> by using the command 2-3 times or until there </w:t>
-      </w:r>
-      <w:proofErr w:type="gramStart"/>
-      <w:r>
-        <w:rPr>
-          <w:rFonts w:ascii="Arial" w:hAnsi="Arial" w:cs="Arial"/>
-        </w:rPr>
-        <w:t>is</w:t>
-      </w:r>
-      <w:proofErr w:type="gramEnd"/>
-      <w:r>
-        <w:rPr>
-          <w:rFonts w:ascii="Arial" w:hAnsi="Arial" w:cs="Arial"/>
-        </w:rPr>
-        <w:t xml:space="preserve"> no more </w:t>
+        <w:t xml:space="preserve"> by using the command 2-3 times or until there is no more </w:t>
       </w:r>
       <w:r>
         <w:rPr>
@@ -18446,10 +18613,6 @@
 </file>
 
 <file path=customXml/item1.xml><?xml version="1.0" encoding="utf-8"?>
-<b:Sources xmlns:b="http://schemas.openxmlformats.org/officeDocument/2006/bibliography" xmlns="http://schemas.openxmlformats.org/officeDocument/2006/bibliography" SelectedStyle="/APA.XSL" StyleName="APA"/>
-</file>
-
-<file path=customXml/item2.xml><?xml version="1.0" encoding="utf-8"?>
 <ct:contentTypeSchema xmlns:ct="http://schemas.microsoft.com/office/2006/metadata/contentType" xmlns:ma="http://schemas.microsoft.com/office/2006/metadata/properties/metaAttributes" ct:_="" ma:_="" ma:contentTypeName="Document" ma:contentTypeID="0x010100CBE00DA33B24AB4E9DD9FF40DFDAAB6B" ma:contentTypeVersion="11" ma:contentTypeDescription="Create a new document." ma:contentTypeScope="" ma:versionID="19f365de1a5061889fb6d1b6617f84f9">
   <xsd:schema xmlns:xsd="http://www.w3.org/2001/XMLSchema" xmlns:xs="http://www.w3.org/2001/XMLSchema" xmlns:p="http://schemas.microsoft.com/office/2006/metadata/properties" xmlns:ns2="1b407e83-da45-41d1-8985-48f949a95199" xmlns:ns3="b2a149f4-6b80-4a5d-9ad3-51bfb403aabf" targetNamespace="http://schemas.microsoft.com/office/2006/metadata/properties" ma:root="true" ma:fieldsID="8df879235fb835da1133e5f310c997d3" ns2:_="" ns3:_="">
     <xsd:import namespace="1b407e83-da45-41d1-8985-48f949a95199"/>
@@ -18644,16 +18807,11 @@
 </ct:contentTypeSchema>
 </file>
 
-<file path=customXml/item3.xml><?xml version="1.0" encoding="utf-8"?>
-<?mso-contentType ?>
-<FormTemplates xmlns="http://schemas.microsoft.com/sharepoint/v3/contenttype/forms">
-  <Display>DocumentLibraryForm</Display>
-  <Edit>DocumentLibraryForm</Edit>
-  <New>DocumentLibraryForm</New>
-</FormTemplates>
+<file path=customXml/item2.xml><?xml version="1.0" encoding="utf-8"?>
+<b:Sources xmlns:b="http://schemas.openxmlformats.org/officeDocument/2006/bibliography" xmlns="http://schemas.openxmlformats.org/officeDocument/2006/bibliography" SelectedStyle="/APA.XSL" StyleName="APA"/>
 </file>
 
-<file path=customXml/item4.xml><?xml version="1.0" encoding="utf-8"?>
+<file path=customXml/item3.xml><?xml version="1.0" encoding="utf-8"?>
 <p:properties xmlns:p="http://schemas.microsoft.com/office/2006/metadata/properties" xmlns:xsi="http://www.w3.org/2001/XMLSchema-instance" xmlns:pc="http://schemas.microsoft.com/office/infopath/2007/PartnerControls">
   <documentManagement>
     <TaxCatchAll xmlns="b2a149f4-6b80-4a5d-9ad3-51bfb403aabf" xsi:nil="true"/>
@@ -18664,15 +18822,16 @@
 </p:properties>
 </file>
 
-<file path=customXml/itemProps1.xml><?xml version="1.0" encoding="utf-8"?>
-<ds:datastoreItem xmlns:ds="http://schemas.openxmlformats.org/officeDocument/2006/customXml" ds:itemID="{EF278816-EC6F-A645-907D-7F25AECB1D4A}">
-  <ds:schemaRefs>
-    <ds:schemaRef ds:uri="http://schemas.openxmlformats.org/officeDocument/2006/bibliography"/>
-  </ds:schemaRefs>
-</ds:datastoreItem>
+<file path=customXml/item4.xml><?xml version="1.0" encoding="utf-8"?>
+<?mso-contentType ?>
+<FormTemplates xmlns="http://schemas.microsoft.com/sharepoint/v3/contenttype/forms">
+  <Display>DocumentLibraryForm</Display>
+  <Edit>DocumentLibraryForm</Edit>
+  <New>DocumentLibraryForm</New>
+</FormTemplates>
 </file>
 
-<file path=customXml/itemProps2.xml><?xml version="1.0" encoding="utf-8"?>
+<file path=customXml/itemProps1.xml><?xml version="1.0" encoding="utf-8"?>
 <ds:datastoreItem xmlns:ds="http://schemas.openxmlformats.org/officeDocument/2006/customXml" ds:itemID="{3334729A-0A1D-4346-81C1-6A5BA8839207}">
   <ds:schemaRefs>
     <ds:schemaRef ds:uri="http://schemas.microsoft.com/office/2006/metadata/contentType"/>
@@ -18691,15 +18850,15 @@
 </ds:datastoreItem>
 </file>
 
-<file path=customXml/itemProps3.xml><?xml version="1.0" encoding="utf-8"?>
-<ds:datastoreItem xmlns:ds="http://schemas.openxmlformats.org/officeDocument/2006/customXml" ds:itemID="{BEE32498-8705-4755-9905-76F23358E2CC}">
+<file path=customXml/itemProps2.xml><?xml version="1.0" encoding="utf-8"?>
+<ds:datastoreItem xmlns:ds="http://schemas.openxmlformats.org/officeDocument/2006/customXml" ds:itemID="{EF278816-EC6F-A645-907D-7F25AECB1D4A}">
   <ds:schemaRefs>
-    <ds:schemaRef ds:uri="http://schemas.microsoft.com/sharepoint/v3/contenttype/forms"/>
+    <ds:schemaRef ds:uri="http://schemas.openxmlformats.org/officeDocument/2006/bibliography"/>
   </ds:schemaRefs>
 </ds:datastoreItem>
 </file>
 
-<file path=customXml/itemProps4.xml><?xml version="1.0" encoding="utf-8"?>
+<file path=customXml/itemProps3.xml><?xml version="1.0" encoding="utf-8"?>
 <ds:datastoreItem xmlns:ds="http://schemas.openxmlformats.org/officeDocument/2006/customXml" ds:itemID="{85B81B1F-52AB-4F75-8EFB-2B5ADFE455BF}">
   <ds:schemaRefs>
     <ds:schemaRef ds:uri="http://schemas.microsoft.com/office/2006/metadata/properties"/>
@@ -18708,4 +18867,12 @@
     <ds:schemaRef ds:uri="1b407e83-da45-41d1-8985-48f949a95199"/>
   </ds:schemaRefs>
 </ds:datastoreItem>
+</file>
+
+<file path=customXml/itemProps4.xml><?xml version="1.0" encoding="utf-8"?>
+<ds:datastoreItem xmlns:ds="http://schemas.openxmlformats.org/officeDocument/2006/customXml" ds:itemID="{BEE32498-8705-4755-9905-76F23358E2CC}">
+  <ds:schemaRefs>
+    <ds:schemaRef ds:uri="http://schemas.microsoft.com/sharepoint/v3/contenttype/forms"/>
+  </ds:schemaRefs>
+</ds:datastoreItem>
 </file>
</xml_diff>